<commit_message>
Sync integrated Omega main manuscript and preserved submission package
Co-Authored-By: Tatsuki Onishi <bougtoir@gmail.com>
</commit_message>
<xml_diff>
--- a/manuscript/manuscript_inline.docx
+++ b/manuscript/manuscript_inline.docx
@@ -420,7 +420,7 @@
           <w:sz w:val="24"/>
           <w:szCs w:val="24"/>
         </w:rPr>
-        <w:t>Outpatient appointment scheduling dates to Bailey [1] and Welch and Bailey [2], with the stochastic core traceable to Lindley [3] and early policy comparisons by Soriano [4]; modern reviews include Cayirli and Veral [5], Cayirli et al. [6], Gupta and Denton [7], and Ahmadi-Javid et al. [8]. Optimal interval design under known stochastic service times is well studied [9-11], as are heuristic rules [12], unpunctuality and interruptions [13, 14], no-shows and overbooking [15-17], and service-time variability [18]. Distributionally robust and conic designs hedge against limited distributional information [19-21].</w:t>
+        <w:t>Outpatient appointment scheduling dates to Bailey [1] and Welch and Bailey [2]; modern reviews include Cayirli and Veral [3], Gupta and Denton [4], and Ahmadi-Javid et al. [5]. Optimal interval design under known stochastic service times is well studied [6, 7], as are heuristic rules, unpunctuality and interruptions, no-shows and overbooking, and service-time variability [8]. Distributionally robust and conic designs hedge against limited distributional information [9, 10].</w:t>
       </w:r>
     </w:p>
     <w:p>
@@ -1669,7 +1669,7 @@
           <w:sz w:val="24"/>
           <w:szCs w:val="24"/>
         </w:rPr>
-        <w:t xml:space="preserve">the finite-horizon Lindley recursion on the lattice of scheduled starts [3]. Physician idle time is </w:t>
+        <w:t xml:space="preserve">the finite-horizon Lindley recursion on the lattice of scheduled starts [11]. Physician idle time is </w:t>
       </w:r>
       <m:oMath>
         <m:r>
@@ -2089,7 +2089,7 @@
           <w:sz w:val="24"/>
           <w:szCs w:val="24"/>
         </w:rPr>
-        <w:t>, the residual work after the scheduled end. The social cost of a session combines waiting, idle time, and overtime, as in established appointment-scheduling formulations [9, 10]:</w:t>
+        <w:t>, the residual work after the scheduled end. The social cost of a session combines waiting, idle time, and overtime, as in established appointment-scheduling formulations [6, 7]:</w:t>
       </w:r>
     </w:p>
     <w:p>
@@ -3052,6 +3052,7 @@
     <w:p>
       <w:pPr>
         <w:keepNext/>
+        <w:spacing w:before="240"/>
       </w:pPr>
       <w:r>
         <w:rPr>
@@ -4093,12 +4094,13 @@
           <w:sz w:val="24"/>
           <w:szCs w:val="24"/>
         </w:rPr>
-        <w:t>Policies evaluated (Table 2), resting on CVaR and robust-optimization machinery [22-24], with general scheduling foundations in Pinedo [25], span: fixed mean-based slots; a conservative fixed slot (mean plus slack); a quantile-based slot; a class-based rule using mixture-component labels where such classes are observable; SAA-optimized uniform and nonuniform intervals; a CVaR-penalized tail-aware uniform interval [22]; a distributionally robust (DRO) uniform interval hedging across a four-family ambiguity set; and the oracle. The DRO policy uses the worst-case expected-cost principle studied in limited-information appointment scheduling and broader DRO frameworks [19-21, 24, 26].</w:t>
+        <w:t>Policies evaluated (Table 2), resting on CVaR and robust-optimization machinery [12-14], with general scheduling foundations in Pinedo [15], span: fixed mean-based slots; a conservative fixed slot (mean plus slack) [16, 17]; a quantile-based slot; a class-based rule using mixture-component labels where such classes are observable; SAA-optimized uniform and nonuniform intervals; a CVaR-penalized tail-aware uniform interval [12]; a distributionally robust (DRO) uniform interval hedging across a four-family ambiguity set; and the oracle. The DRO policy uses the worst-case expected-cost principle studied in limited-information appointment scheduling and broader DRO frameworks [9, 10, 14, 18, 19].</w:t>
       </w:r>
     </w:p>
     <w:p>
       <w:pPr>
         <w:keepNext/>
+        <w:spacing w:before="240"/>
       </w:pPr>
       <w:r>
         <w:rPr>
@@ -5517,6 +5519,9 @@
       </w:r>
     </w:p>
     <w:p>
+      <w:pPr>
+        <w:spacing w:before="240"/>
+      </w:pPr>
       <w:r>
         <w:rPr>
           <w:rFonts w:ascii="Times New Roman" w:hAnsi="Times New Roman" w:cs="Times New Roman" w:eastAsia="Times New Roman"/>
@@ -5987,7 +5992,7 @@
           <w:sz w:val="24"/>
           <w:szCs w:val="24"/>
         </w:rPr>
-        <w:t xml:space="preserve"> with boundary refinement where regret surfaces curve. In the misspecification study the designing distribution differs from the generating distribution in family, parameters, or both. For estimation uncertainty (Supplementary Fig. S1) we draw </w:t>
+        <w:t xml:space="preserve"> with boundary refinement where regret surfaces curve. In the misspecification study the designing distribution differs from the generating distribution in family, parameters, or both. For estimation uncertainty we draw </w:t>
       </w:r>
       <m:oMath>
         <m:r>
@@ -6117,7 +6122,150 @@
           <w:sz w:val="24"/>
           <w:szCs w:val="24"/>
         </w:rPr>
-        <w:t>Operational robustness additionally varies no-show probabilities and arrival jitter, reflecting established appointment models with absences and unpunctuality [14-16].</w:t>
+        <w:t xml:space="preserve">Operational robustness additionally varies no-show probabilities and arrival jitter, reflecting established appointment models with absences and unpunctuality [20-23]. The no-show probabilities are </w:t>
+      </w:r>
+      <m:oMath>
+        <m:r>
+          <m:rPr>
+            <m:sty m:val="i"/>
+          </m:rPr>
+          <w:rPr>
+            <w:rFonts w:ascii="Times New Roman" w:hAnsi="Times New Roman" w:cs="Times New Roman" w:eastAsia="Times New Roman"/>
+            <w:color w:val="000000"/>
+            <w:sz w:val="24"/>
+            <w:szCs w:val="24"/>
+          </w:rPr>
+          <m:t>p</m:t>
+        </m:r>
+        <m:r>
+          <m:rPr>
+            <m:sty m:val="p"/>
+          </m:rPr>
+          <w:rPr>
+            <w:rFonts w:ascii="Times New Roman" w:hAnsi="Times New Roman" w:cs="Times New Roman" w:eastAsia="Times New Roman"/>
+            <w:color w:val="000000"/>
+            <w:sz w:val="24"/>
+            <w:szCs w:val="24"/>
+          </w:rPr>
+          <m:t>∈</m:t>
+        </m:r>
+        <m:r>
+          <m:rPr>
+            <m:sty m:val="p"/>
+          </m:rPr>
+          <w:rPr>
+            <w:rFonts w:ascii="Times New Roman" w:hAnsi="Times New Roman" w:cs="Times New Roman" w:eastAsia="Times New Roman"/>
+            <w:color w:val="000000"/>
+            <w:sz w:val="24"/>
+            <w:szCs w:val="24"/>
+          </w:rPr>
+          <m:t>{</m:t>
+        </m:r>
+        <m:r>
+          <m:rPr>
+            <m:sty m:val="p"/>
+          </m:rPr>
+          <w:rPr>
+            <w:rFonts w:ascii="Times New Roman" w:hAnsi="Times New Roman" w:cs="Times New Roman" w:eastAsia="Times New Roman"/>
+            <w:color w:val="000000"/>
+            <w:sz w:val="24"/>
+            <w:szCs w:val="24"/>
+          </w:rPr>
+          <m:t>0</m:t>
+        </m:r>
+        <m:r>
+          <m:rPr>
+            <m:sty m:val="p"/>
+          </m:rPr>
+          <w:rPr>
+            <w:rFonts w:ascii="Times New Roman" w:hAnsi="Times New Roman" w:cs="Times New Roman" w:eastAsia="Times New Roman"/>
+            <w:color w:val="000000"/>
+            <w:sz w:val="24"/>
+            <w:szCs w:val="24"/>
+          </w:rPr>
+          <m:t>,</m:t>
+        </m:r>
+        <m:r>
+          <m:rPr>
+            <m:sty m:val="i"/>
+          </m:rPr>
+          <w:rPr>
+            <w:rFonts w:ascii="Times New Roman" w:hAnsi="Times New Roman" w:cs="Times New Roman" w:eastAsia="Times New Roman"/>
+            <w:color w:val="000000"/>
+            <w:sz w:val="24"/>
+            <w:szCs w:val="24"/>
+          </w:rPr>
+          <m:t>.05</m:t>
+        </m:r>
+        <m:r>
+          <m:rPr>
+            <m:sty m:val="p"/>
+          </m:rPr>
+          <w:rPr>
+            <w:rFonts w:ascii="Times New Roman" w:hAnsi="Times New Roman" w:cs="Times New Roman" w:eastAsia="Times New Roman"/>
+            <w:color w:val="000000"/>
+            <w:sz w:val="24"/>
+            <w:szCs w:val="24"/>
+          </w:rPr>
+          <m:t>,</m:t>
+        </m:r>
+        <m:r>
+          <m:rPr>
+            <m:sty m:val="i"/>
+          </m:rPr>
+          <w:rPr>
+            <w:rFonts w:ascii="Times New Roman" w:hAnsi="Times New Roman" w:cs="Times New Roman" w:eastAsia="Times New Roman"/>
+            <w:color w:val="000000"/>
+            <w:sz w:val="24"/>
+            <w:szCs w:val="24"/>
+          </w:rPr>
+          <m:t>.10</m:t>
+        </m:r>
+        <m:r>
+          <m:rPr>
+            <m:sty m:val="p"/>
+          </m:rPr>
+          <w:rPr>
+            <w:rFonts w:ascii="Times New Roman" w:hAnsi="Times New Roman" w:cs="Times New Roman" w:eastAsia="Times New Roman"/>
+            <w:color w:val="000000"/>
+            <w:sz w:val="24"/>
+            <w:szCs w:val="24"/>
+          </w:rPr>
+          <m:t>,</m:t>
+        </m:r>
+        <m:r>
+          <m:rPr>
+            <m:sty m:val="i"/>
+          </m:rPr>
+          <w:rPr>
+            <w:rFonts w:ascii="Times New Roman" w:hAnsi="Times New Roman" w:cs="Times New Roman" w:eastAsia="Times New Roman"/>
+            <w:color w:val="000000"/>
+            <w:sz w:val="24"/>
+            <w:szCs w:val="24"/>
+          </w:rPr>
+          <m:t>.20</m:t>
+        </m:r>
+        <m:r>
+          <m:rPr>
+            <m:sty m:val="p"/>
+          </m:rPr>
+          <w:rPr>
+            <w:rFonts w:ascii="Times New Roman" w:hAnsi="Times New Roman" w:cs="Times New Roman" w:eastAsia="Times New Roman"/>
+            <w:color w:val="000000"/>
+            <w:sz w:val="24"/>
+            <w:szCs w:val="24"/>
+          </w:rPr>
+          <m:t>}</m:t>
+        </m:r>
+      </m:oMath>
+      <w:r>
+        <w:rPr>
+          <w:rFonts w:ascii="Times New Roman" w:hAnsi="Times New Roman" w:cs="Times New Roman" w:eastAsia="Times New Roman"/>
+          <w:color w:val="000000"/>
+          <w:sz w:val="24"/>
+          <w:szCs w:val="24"/>
+        </w:rPr>
+        <w:t xml:space="preserve"> and arrival jitter has sd 0 or 2 min.</w:t>
       </w:r>
     </w:p>
     <w:p>
@@ -6676,6 +6824,9 @@
       </w:r>
     </w:p>
     <w:p>
+      <w:pPr>
+        <w:spacing w:before="240"/>
+      </w:pPr>
       <w:r>
         <w:rPr>
           <w:rFonts w:ascii="Times New Roman" w:hAnsi="Times New Roman" w:cs="Times New Roman" w:eastAsia="Times New Roman"/>
@@ -6782,6 +6933,7 @@
     <w:p>
       <w:pPr>
         <w:keepNext/>
+        <w:spacing w:before="240"/>
       </w:pPr>
       <w:r>
         <w:rPr>
@@ -8351,6 +8503,9 @@
       </w:r>
     </w:p>
     <w:p>
+      <w:pPr>
+        <w:spacing w:before="240"/>
+      </w:pPr>
       <w:r>
         <w:rPr>
           <w:rFonts w:ascii="Times New Roman" w:hAnsi="Times New Roman" w:cs="Times New Roman" w:eastAsia="Times New Roman"/>
@@ -8416,7 +8571,87 @@
           <w:sz w:val="24"/>
           <w:szCs w:val="24"/>
         </w:rPr>
-        <w:t xml:space="preserve">Optimizing the interval under a wrongly assumed family is not free insurance (Fig. 4): the worst off-diagonal cell adds 446 cost units relative to the correctly specified design — more than the gap between fixed slots and the oracle for several true distributions. Under-designing (assuming a lower-CV family than the truth) is consistently worse than over-designing. With moment-fitted gamma designs, median estimation regret is already small at </w:t>
+        <w:t>Optimizing the interval under a wrongly assumed family is not free insurance (Fig. 4): the worst off-diagonal cell adds 446 cost units relative to the correctly specified design — more than the gap between fixed slots and the oracle for several true distributions. Under-designing (assuming a lower-CV family than the truth) is consistently worse than over-designing.</w:t>
+      </w:r>
+    </w:p>
+    <w:p>
+      <w:pPr>
+        <w:keepNext/>
+      </w:pPr>
+      <w:r>
+        <w:rPr>
+          <w:rFonts w:ascii="Times New Roman" w:hAnsi="Times New Roman" w:cs="Times New Roman" w:eastAsia="Times New Roman"/>
+          <w:color w:val="000000"/>
+          <w:sz w:val="24"/>
+          <w:szCs w:val="24"/>
+        </w:rPr>
+        <w:drawing>
+          <wp:inline xmlns:a="http://schemas.openxmlformats.org/drawingml/2006/main" xmlns:pic="http://schemas.openxmlformats.org/drawingml/2006/picture">
+            <wp:extent cx="5486400" cy="4397969"/>
+            <wp:docPr id="4" name="Picture 4"/>
+            <wp:cNvGraphicFramePr>
+              <a:graphicFrameLocks noChangeAspect="1"/>
+            </wp:cNvGraphicFramePr>
+            <a:graphic>
+              <a:graphicData uri="http://schemas.openxmlformats.org/drawingml/2006/picture">
+                <pic:pic>
+                  <pic:nvPicPr>
+                    <pic:cNvPr id="0" name="fig4_misspec_matrix.png"/>
+                    <pic:cNvPicPr/>
+                  </pic:nvPicPr>
+                  <pic:blipFill>
+                    <a:blip r:embed="rId12"/>
+                    <a:stretch>
+                      <a:fillRect/>
+                    </a:stretch>
+                  </pic:blipFill>
+                  <pic:spPr>
+                    <a:xfrm>
+                      <a:off x="0" y="0"/>
+                      <a:ext cx="5486400" cy="4397969"/>
+                    </a:xfrm>
+                    <a:prstGeom prst="rect"/>
+                  </pic:spPr>
+                </pic:pic>
+              </a:graphicData>
+            </a:graphic>
+          </wp:inline>
+        </w:drawing>
+      </w:r>
+    </w:p>
+    <w:p>
+      <w:pPr>
+        <w:spacing w:before="240"/>
+      </w:pPr>
+      <w:r>
+        <w:rPr>
+          <w:rFonts w:ascii="Times New Roman" w:hAnsi="Times New Roman" w:cs="Times New Roman" w:eastAsia="Times New Roman"/>
+          <w:b/>
+          <w:sz w:val="20"/>
+          <w:color w:val="000000"/>
+          <w:szCs w:val="20"/>
+        </w:rPr>
+        <w:t xml:space="preserve">Figure 4. </w:t>
+      </w:r>
+      <w:r>
+        <w:rPr>
+          <w:rFonts w:ascii="Times New Roman" w:hAnsi="Times New Roman" w:cs="Times New Roman" w:eastAsia="Times New Roman"/>
+          <w:sz w:val="20"/>
+          <w:color w:val="000000"/>
+          <w:szCs w:val="20"/>
+        </w:rPr>
+        <w:t>True x assumed distribution matrix: excess cost of misspecification.</w:t>
+      </w:r>
+    </w:p>
+    <w:p>
+      <w:r>
+        <w:rPr>
+          <w:rFonts w:ascii="Times New Roman" w:hAnsi="Times New Roman" w:cs="Times New Roman" w:eastAsia="Times New Roman"/>
+          <w:color w:val="000000"/>
+          <w:sz w:val="24"/>
+          <w:szCs w:val="24"/>
+        </w:rPr>
+        <w:t xml:space="preserve">With moment-fitted gamma designs (Fig. 5), median estimation regret is already small at </w:t>
       </w:r>
       <m:oMath>
         <m:r>
@@ -8667,8 +8902,8 @@
         </w:rPr>
         <w:drawing>
           <wp:inline xmlns:a="http://schemas.openxmlformats.org/drawingml/2006/main" xmlns:pic="http://schemas.openxmlformats.org/drawingml/2006/picture">
-            <wp:extent cx="5486400" cy="4397969"/>
-            <wp:docPr id="4" name="Picture 4"/>
+            <wp:extent cx="5486400" cy="3182950"/>
+            <wp:docPr id="5" name="Picture 5"/>
             <wp:cNvGraphicFramePr>
               <a:graphicFrameLocks noChangeAspect="1"/>
             </wp:cNvGraphicFramePr>
@@ -8676,11 +8911,11 @@
               <a:graphicData uri="http://schemas.openxmlformats.org/drawingml/2006/picture">
                 <pic:pic>
                   <pic:nvPicPr>
-                    <pic:cNvPr id="0" name="fig4_misspec_matrix.png"/>
+                    <pic:cNvPr id="0" name="fig5_estimation.png"/>
                     <pic:cNvPicPr/>
                   </pic:nvPicPr>
                   <pic:blipFill>
-                    <a:blip r:embed="rId12"/>
+                    <a:blip r:embed="rId13"/>
                     <a:stretch>
                       <a:fillRect/>
                     </a:stretch>
@@ -8688,7 +8923,7 @@
                   <pic:spPr>
                     <a:xfrm>
                       <a:off x="0" y="0"/>
-                      <a:ext cx="5486400" cy="4397969"/>
+                      <a:ext cx="5486400" cy="3182950"/>
                     </a:xfrm>
                     <a:prstGeom prst="rect"/>
                   </pic:spPr>
@@ -8700,6 +8935,9 @@
       </w:r>
     </w:p>
     <w:p>
+      <w:pPr>
+        <w:spacing w:before="240"/>
+      </w:pPr>
       <w:r>
         <w:rPr>
           <w:rFonts w:ascii="Times New Roman" w:hAnsi="Times New Roman" w:cs="Times New Roman" w:eastAsia="Times New Roman"/>
@@ -8708,7 +8946,7 @@
           <w:color w:val="000000"/>
           <w:szCs w:val="20"/>
         </w:rPr>
-        <w:t xml:space="preserve">Figure 4. </w:t>
+        <w:t xml:space="preserve">Figure 5. </w:t>
       </w:r>
       <w:r>
         <w:rPr>
@@ -8717,7 +8955,71 @@
           <w:color w:val="000000"/>
           <w:szCs w:val="20"/>
         </w:rPr>
-        <w:t>True x assumed distribution matrix: excess cost of misspecification.</w:t>
+        <w:t xml:space="preserve">Moment-fitted gamma design regret vs historical sample size </w:t>
+      </w:r>
+      <m:oMath>
+        <m:r>
+          <m:rPr>
+            <m:sty m:val="i"/>
+          </m:rPr>
+          <w:rPr>
+            <w:rFonts w:ascii="Times New Roman" w:hAnsi="Times New Roman" w:cs="Times New Roman" w:eastAsia="Times New Roman"/>
+            <w:color w:val="000000"/>
+            <w:sz w:val="20"/>
+            <w:szCs w:val="20"/>
+          </w:rPr>
+          <m:t>n</m:t>
+        </m:r>
+      </m:oMath>
+      <w:r>
+        <w:rPr>
+          <w:rFonts w:ascii="Times New Roman" w:hAnsi="Times New Roman" w:cs="Times New Roman" w:eastAsia="Times New Roman"/>
+          <w:sz w:val="20"/>
+          <w:color w:val="000000"/>
+          <w:szCs w:val="20"/>
+        </w:rPr>
+        <w:t xml:space="preserve">: </w:t>
+      </w:r>
+      <m:oMath>
+        <m:sSub>
+          <m:e>
+            <m:r>
+              <m:rPr>
+                <m:sty m:val="i"/>
+              </m:rPr>
+              <w:rPr>
+                <w:rFonts w:ascii="Times New Roman" w:hAnsi="Times New Roman" w:cs="Times New Roman" w:eastAsia="Times New Roman"/>
+                <w:color w:val="000000"/>
+                <w:sz w:val="20"/>
+                <w:szCs w:val="20"/>
+              </w:rPr>
+              <m:t>Q</m:t>
+            </m:r>
+          </m:e>
+          <m:sub>
+            <m:r>
+              <m:rPr>
+                <m:sty m:val="p"/>
+              </m:rPr>
+              <w:rPr>
+                <w:rFonts w:ascii="Times New Roman" w:hAnsi="Times New Roman" w:cs="Times New Roman" w:eastAsia="Times New Roman"/>
+                <w:color w:val="000000"/>
+                <w:sz w:val="20"/>
+                <w:szCs w:val="20"/>
+              </w:rPr>
+              <m:t>90</m:t>
+            </m:r>
+          </m:sub>
+        </m:sSub>
+      </m:oMath>
+      <w:r>
+        <w:rPr>
+          <w:rFonts w:ascii="Times New Roman" w:hAnsi="Times New Roman" w:cs="Times New Roman" w:eastAsia="Times New Roman"/>
+          <w:sz w:val="20"/>
+          <w:color w:val="000000"/>
+          <w:szCs w:val="20"/>
+        </w:rPr>
+        <w:t xml:space="preserve"> regret over 400 replications per cell.</w:t>
       </w:r>
     </w:p>
     <w:p>
@@ -8742,12 +9044,13 @@
           <w:sz w:val="24"/>
           <w:szCs w:val="24"/>
         </w:rPr>
-        <w:t>The SAA-optimized uniform interval is the workhorse: mean relative regret 1.2% and maximum 1.4% across all ten service-time specs versus oracle, and within 5% of oracle in every studied scenario (Table 4). Nonuniform position-dependent intervals recover essentially the remaining gap — the incremental saving over the optimized uniform interval is only 0.6–1.4% of session cost — while the DRO uniform interval and the CVaR-penalized tail-aware design are farther from the oracle in expected cost (the CVaR design optimizes a different objective, trading expected cost for worst-quantile protection; it is not a failure of the method). Class-based rules help only where observable classes exist (mixture specs). We stress that near-oracle performance of the uniform interval reflects the value of scalar optimization under a known or estimated family, not distributionally robust behavior per se; the misspecification study in Section 4.3 is what measures model risk. Conservative fixed slots (mean + 25%) recover much of the gap but at materially higher idle time. The interval sweep traces the waiting–idle/overtime frontier (Fig. 5); all optimized policies sit on or near that frontier, so the choice reduces to where on the frontier the cost weights place the clinic. The pattern is stable under cost weights ranging (1,1,1) to (1,2,6): the optimized uniform interval's maximum regret stays at or below 2.5% across the weight grid. Under no-shows up to 20% and arrival jitter, policy orderings weaken as expected — the CVaR tail-aware design beats the mean-based rule in 33.3% of disrupted conditions at 10% no-shows and in none at 20% — because disruptions themselves add service-time noise and lower effective load, narrowing the gap between policies.</w:t>
+        <w:t>The SAA-optimized uniform interval is the workhorse: mean relative regret 1.2% and maximum 1.4% across all ten service-time specs versus oracle, and within 5% of oracle in every studied scenario (Table 4). Nonuniform position-dependent intervals recover essentially the remaining gap — the incremental saving over the optimized uniform interval is only 0.6–1.4% of session cost — while the DRO uniform interval and the CVaR-penalized tail-aware design are farther from the oracle in expected cost (the CVaR design optimizes a different objective, trading expected cost for worst-quantile protection; it is not a failure of the method). Class-based rules help only where observable classes exist (mixture specs). We stress that near-oracle performance of the uniform interval reflects the value of scalar optimization under a known or estimated family, not distributionally robust behavior per se; the misspecification study in Section 4.3 is what measures model risk. Conservative fixed slots (mean + 25%) recover much of the gap but at materially higher idle time. The interval sweep traces the waiting–idle/overtime frontier (Fig. 6); all optimized policies sit on or near that frontier, so the choice reduces to where on the frontier the cost weights place the clinic. The pattern is stable under cost weights ranging (1,1,1) to (1,2,6): the optimized uniform interval's maximum regret stays at or below 2.5% across the weight grid. Under no-shows up to 20% and arrival jitter, policy orderings weaken as expected — the CVaR tail-aware design beats the mean-based rule in 33.3% of disrupted conditions at 10% no-shows and in none at 20% — because disruptions themselves add service-time noise and lower effective load, narrowing the gap between policies.</w:t>
       </w:r>
     </w:p>
     <w:p>
       <w:pPr>
         <w:keepNext/>
+        <w:spacing w:before="240"/>
       </w:pPr>
       <w:r>
         <w:rPr>
@@ -10124,7 +10427,7 @@
         <w:drawing>
           <wp:inline xmlns:a="http://schemas.openxmlformats.org/drawingml/2006/main" xmlns:pic="http://schemas.openxmlformats.org/drawingml/2006/picture">
             <wp:extent cx="5486400" cy="1911648"/>
-            <wp:docPr id="5" name="Picture 5"/>
+            <wp:docPr id="6" name="Picture 6"/>
             <wp:cNvGraphicFramePr>
               <a:graphicFrameLocks noChangeAspect="1"/>
             </wp:cNvGraphicFramePr>
@@ -10132,11 +10435,11 @@
               <a:graphicData uri="http://schemas.openxmlformats.org/drawingml/2006/picture">
                 <pic:pic>
                   <pic:nvPicPr>
-                    <pic:cNvPr id="0" name="fig5_pareto.png"/>
+                    <pic:cNvPr id="0" name="fig6_pareto.png"/>
                     <pic:cNvPicPr/>
                   </pic:nvPicPr>
                   <pic:blipFill>
-                    <a:blip r:embed="rId13"/>
+                    <a:blip r:embed="rId14"/>
                     <a:stretch>
                       <a:fillRect/>
                     </a:stretch>
@@ -10156,6 +10459,9 @@
       </w:r>
     </w:p>
     <w:p>
+      <w:pPr>
+        <w:spacing w:before="240"/>
+      </w:pPr>
       <w:r>
         <w:rPr>
           <w:rFonts w:ascii="Times New Roman" w:hAnsi="Times New Roman" w:cs="Times New Roman" w:eastAsia="Times New Roman"/>
@@ -10164,7 +10470,7 @@
           <w:color w:val="000000"/>
           <w:szCs w:val="20"/>
         </w:rPr>
-        <w:t xml:space="preserve">Figure 5. </w:t>
+        <w:t xml:space="preserve">Figure 6. </w:t>
       </w:r>
       <w:r>
         <w:rPr>
@@ -10198,7 +10504,7 @@
           <w:sz w:val="24"/>
           <w:szCs w:val="24"/>
         </w:rPr>
-        <w:t>A single 45-min consultation injected mid-session produces a delay cascade lasting 15 subsequent appointments and 422 min of extra cumulative waiting (Fig. 6). Early-session shocks are costlier in aggregate waiting; end-of-session shocks convert to overtime instead.</w:t>
+        <w:t>A single 45-min consultation injected mid-session produces a delay cascade lasting 15 subsequent appointments and 422 min of extra cumulative waiting (Fig. 7). Early-session shocks are costlier in aggregate waiting; end-of-session shocks convert to overtime instead.</w:t>
       </w:r>
     </w:p>
     <w:p>
@@ -10215,7 +10521,7 @@
         <w:drawing>
           <wp:inline xmlns:a="http://schemas.openxmlformats.org/drawingml/2006/main" xmlns:pic="http://schemas.openxmlformats.org/drawingml/2006/picture">
             <wp:extent cx="5486400" cy="3237598"/>
-            <wp:docPr id="6" name="Picture 6"/>
+            <wp:docPr id="7" name="Picture 7"/>
             <wp:cNvGraphicFramePr>
               <a:graphicFrameLocks noChangeAspect="1"/>
             </wp:cNvGraphicFramePr>
@@ -10223,11 +10529,11 @@
               <a:graphicData uri="http://schemas.openxmlformats.org/drawingml/2006/picture">
                 <pic:pic>
                   <pic:nvPicPr>
-                    <pic:cNvPr id="0" name="fig6_cascade.png"/>
+                    <pic:cNvPr id="0" name="fig7_cascade.png"/>
                     <pic:cNvPicPr/>
                   </pic:nvPicPr>
                   <pic:blipFill>
-                    <a:blip r:embed="rId14"/>
+                    <a:blip r:embed="rId15"/>
                     <a:stretch>
                       <a:fillRect/>
                     </a:stretch>
@@ -10247,6 +10553,9 @@
       </w:r>
     </w:p>
     <w:p>
+      <w:pPr>
+        <w:spacing w:before="240"/>
+      </w:pPr>
       <w:r>
         <w:rPr>
           <w:rFonts w:ascii="Times New Roman" w:hAnsi="Times New Roman" w:cs="Times New Roman" w:eastAsia="Times New Roman"/>
@@ -10255,7 +10564,7 @@
           <w:color w:val="000000"/>
           <w:szCs w:val="20"/>
         </w:rPr>
-        <w:t xml:space="preserve">Figure 6. </w:t>
+        <w:t xml:space="preserve">Figure 7. </w:t>
       </w:r>
       <w:r>
         <w:rPr>
@@ -10264,7 +10573,43 @@
           <w:color w:val="000000"/>
           <w:szCs w:val="20"/>
         </w:rPr>
-        <w:t>Delay cascade from a single injected 45-min consultation.</w:t>
+        <w:t xml:space="preserve">Delay cascade from a single injected 45-min consultation; cascade length counts downstream appointments with </w:t>
+      </w:r>
+      <m:oMath>
+        <m:r>
+          <m:rPr>
+            <m:lit m:val="1"/>
+            <m:sty m:val="p"/>
+          </m:rPr>
+          <w:rPr>
+            <w:rFonts w:ascii="Times New Roman" w:hAnsi="Times New Roman" w:cs="Times New Roman" w:eastAsia="Times New Roman"/>
+            <w:color w:val="000000"/>
+            <w:sz w:val="20"/>
+            <w:szCs w:val="20"/>
+          </w:rPr>
+          <m:t>&gt;</m:t>
+        </m:r>
+        <m:r>
+          <m:rPr>
+            <m:sty m:val="p"/>
+          </m:rPr>
+          <w:rPr>
+            <w:rFonts w:ascii="Times New Roman" w:hAnsi="Times New Roman" w:cs="Times New Roman" w:eastAsia="Times New Roman"/>
+            <w:color w:val="000000"/>
+            <w:sz w:val="20"/>
+            <w:szCs w:val="20"/>
+          </w:rPr>
+          <m:t>1</m:t>
+        </m:r>
+      </m:oMath>
+      <w:r>
+        <w:rPr>
+          <w:rFonts w:ascii="Times New Roman" w:hAnsi="Times New Roman" w:cs="Times New Roman" w:eastAsia="Times New Roman"/>
+          <w:sz w:val="20"/>
+          <w:color w:val="000000"/>
+          <w:szCs w:val="20"/>
+        </w:rPr>
+        <w:t xml:space="preserve"> min added waiting.</w:t>
       </w:r>
     </w:p>
     <w:p>
@@ -10390,7 +10735,7 @@
           <w:sz w:val="24"/>
           <w:szCs w:val="24"/>
         </w:rPr>
-        <w:t>) for each family yields a compact map of where optimization value concentrates (Fig. 7): there is no corner of the explored space where mean-based slots are competitive, and the benefit of optimization rises sharply with session size and tail ratio — exactly where a clinic should adopt the one-parameter optimized uniform interval. Because the optimized uniform interval already sits at the oracle boundary across the map, the map prescribes where to optimize, not which of several complex policies to choose.</w:t>
+        <w:t>) for each family yields a compact map of where optimization value concentrates (Fig. 8): there is no corner of the explored space where mean-based slots are competitive, and the benefit of optimization rises sharply with session size and tail ratio — exactly where a clinic should adopt the one-parameter optimized uniform interval. Because the optimized uniform interval already sits at the oracle boundary across the map, the map prescribes where to optimize, not which of several complex policies to choose.</w:t>
       </w:r>
     </w:p>
     <w:p>
@@ -10407,7 +10752,7 @@
         <w:drawing>
           <wp:inline xmlns:a="http://schemas.openxmlformats.org/drawingml/2006/main" xmlns:pic="http://schemas.openxmlformats.org/drawingml/2006/picture">
             <wp:extent cx="5486400" cy="3376634"/>
-            <wp:docPr id="7" name="Picture 7"/>
+            <wp:docPr id="8" name="Picture 8"/>
             <wp:cNvGraphicFramePr>
               <a:graphicFrameLocks noChangeAspect="1"/>
             </wp:cNvGraphicFramePr>
@@ -10415,11 +10760,11 @@
               <a:graphicData uri="http://schemas.openxmlformats.org/drawingml/2006/picture">
                 <pic:pic>
                   <pic:nvPicPr>
-                    <pic:cNvPr id="0" name="fig7_decision_map.png"/>
+                    <pic:cNvPr id="0" name="fig8_decision_map.png"/>
                     <pic:cNvPicPr/>
                   </pic:nvPicPr>
                   <pic:blipFill>
-                    <a:blip r:embed="rId15"/>
+                    <a:blip r:embed="rId16"/>
                     <a:stretch>
                       <a:fillRect/>
                     </a:stretch>
@@ -10439,6 +10784,9 @@
       </w:r>
     </w:p>
     <w:p>
+      <w:pPr>
+        <w:spacing w:before="240"/>
+      </w:pPr>
       <w:r>
         <w:rPr>
           <w:rFonts w:ascii="Times New Roman" w:hAnsi="Times New Roman" w:cs="Times New Roman" w:eastAsia="Times New Roman"/>
@@ -10447,7 +10795,7 @@
           <w:color w:val="000000"/>
           <w:szCs w:val="20"/>
         </w:rPr>
-        <w:t xml:space="preserve">Figure 7. </w:t>
+        <w:t xml:space="preserve">Figure 8. </w:t>
       </w:r>
       <w:r>
         <w:rPr>
@@ -10575,7 +10923,7 @@
           <w:sz w:val="24"/>
           <w:szCs w:val="24"/>
         </w:rPr>
-        <w:t>) from the value of information (upper-tail descriptors determine how large the stakes are) and from scheduling complexity (nearly worthless beyond the scalar interval). This result complements established interval-optimization studies [9-11, 27-29] by quantifying the marginal value of added schedule complexity in the tested setting.</w:t>
+        <w:t>) from the value of information (upper-tail descriptors determine how large the stakes are) and from scheduling complexity (nearly worthless beyond the scalar interval). This result complements established interval-optimization studies [6, 7, 24-27] by quantifying the marginal value of added schedule complexity in the tested setting.</w:t>
       </w:r>
     </w:p>
     <w:p>
@@ -10586,7 +10934,7 @@
           <w:sz w:val="24"/>
           <w:szCs w:val="24"/>
         </w:rPr>
-        <w:t>Second, distributional model risk is real and asymmetric. Designs optimized under a wrongly assumed family can exceed the cost of no optimization at all (the mean-only column of Fig. 4 is the worst), and under-designing the interval is on average about three times as costly as over-designing it (mean excess 104 vs 28 cost units). The estimation study quantifies how much history is needed: for the finite-moment and light-tailed families studied, moment-based designs are already stable at ~250 observations, while the genuinely heavy-tailed Pareto stress case never stabilizes — there, family diagnosis matters more than sample size. Limited-distribution-information approaches provide a relevant framework for interpreting this model risk [19, 24, 26].</w:t>
+        <w:t>Second, distributional model risk is real and asymmetric. Designs optimized under a wrongly assumed family can exceed the cost of no optimization at all (the mean-only column of Fig. 4 is the worst), and under-designing the interval is on average about three times as costly as over-designing it (mean excess 104 vs 28 cost units). The estimation study quantifies how much history is needed: for the finite-moment and light-tailed families studied, moment-based designs are already stable at ~250 observations, while the genuinely heavy-tailed Pareto stress case never stabilizes — there, family diagnosis matters more than sample size. Limited-distribution-information approaches provide a relevant framework for interpreting this model risk [9, 14, 18].</w:t>
       </w:r>
     </w:p>
     <w:p>
@@ -10619,7 +10967,7 @@
           <w:sz w:val="24"/>
           <w:szCs w:val="24"/>
         </w:rPr>
-        <w:t>Limitations: synthetic service times calibrated in mean and CV; a single-provider, single-session model; punctual arrivals in the base case; specific cost weights and a bounded weight grid; SAA policy optimization that is itself subject to the misspecification we document; a nonexhaustive set of families; and no empirical external validation on measured consultation times. The mechanisms (finite-horizon delay accumulation, scalar-interval sufficiency) plausibly extend to analogous finite-horizon scheduled services — procedure blocks, imaging sessions, service counters — but that generalization is a conjecture, not a result. Validation on measured consultation-time data and multi-provider extensions are natural next steps. These extensions address operational features emphasized in the broader appointment-scheduling literature [5-8, 30].</w:t>
+        <w:t>Limitations: synthetic service times calibrated in mean and CV; a single-provider, single-session model; punctual arrivals in the base case; specific cost weights and a bounded weight grid; SAA policy optimization that is itself subject to the misspecification we document; a nonexhaustive set of families; and no empirical external validation on measured consultation times. The mechanisms (finite-horizon delay accumulation, scalar-interval sufficiency) plausibly extend to analogous finite-horizon scheduled services — procedure blocks, imaging sessions, service counters — but that generalization is a conjecture, not a result. Validation on measured consultation-time data and multi-provider extensions are natural next steps. These extensions address operational features emphasized in the broader appointment-scheduling literature [3-5, 28-30].</w:t>
       </w:r>
     </w:p>
     <w:p>
@@ -10813,7 +11161,7 @@
           <w:sz w:val="24"/>
           <w:szCs w:val="24"/>
         </w:rPr>
-        <w:t>[3] Lindley DV. The theory of queues with a single server. Mathematical Proceedings of the Cambridge Philosophical Society 1952;48(2):277–289. https://doi.org/10.1017/s0305004100027638.</w:t>
+        <w:t>[3] Cayirli T, Veral E. Outpatient scheduling in health care: a review of literature. Production and Operations Management 2003;12(4):519–549. https://doi.org/10.1111/j.1937-5956.2003.tb00218.x.</w:t>
       </w:r>
     </w:p>
     <w:p>
@@ -10824,7 +11172,7 @@
           <w:sz w:val="24"/>
           <w:szCs w:val="24"/>
         </w:rPr>
-        <w:t>[4] Soriano A. Comparison of two scheduling systems. Operations Research 1966;14(3):388–397. https://doi.org/10.1287/opre.14.3.388.</w:t>
+        <w:t>[4] Gupta D, Denton B. Appointment scheduling in health care: challenges and opportunities. IIE Transactions 2008;40(9):800–819. https://doi.org/10.1080/07408170802165880.</w:t>
       </w:r>
     </w:p>
     <w:p>
@@ -10835,7 +11183,7 @@
           <w:sz w:val="24"/>
           <w:szCs w:val="24"/>
         </w:rPr>
-        <w:t>[5] Cayirli T, Veral E. Outpatient scheduling in health care: a review of literature. Production and Operations Management 2003;12(4):519–549. https://doi.org/10.1111/j.1937-5956.2003.tb00218.x.</w:t>
+        <w:t>[5] Ahmadi-Javid A, Jalali Z, Klassen KJ. Outpatient appointment systems in healthcare: a review of optimization studies. European Journal of Operational Research 2017;258(1):3–34. https://doi.org/10.1016/j.ejor.2016.06.064.</w:t>
       </w:r>
     </w:p>
     <w:p>
@@ -10846,7 +11194,7 @@
           <w:sz w:val="24"/>
           <w:szCs w:val="24"/>
         </w:rPr>
-        <w:t>[6] Cayirli T, Veral E, Rosen H. Designing appointment scheduling systems for ambulatory care services. Health Care Management Science 2006;9(1):47–58. https://doi.org/10.1007/s10729-006-6279-5.</w:t>
+        <w:t>[6] Denton B, Gupta D. A sequential bounding approach for optimal appointment scheduling. IIE Transactions 2003;35(11):1003–1016. https://doi.org/10.1080/07408170304395.</w:t>
       </w:r>
     </w:p>
     <w:p>
@@ -10857,7 +11205,7 @@
           <w:sz w:val="24"/>
           <w:szCs w:val="24"/>
         </w:rPr>
-        <w:t>[7] Gupta D, Denton B. Appointment scheduling in health care: challenges and opportunities. IIE Transactions 2008;40(9):800–819. https://doi.org/10.1080/07408170802165880.</w:t>
+        <w:t>[7] Kaandorp GC, Koole G. Optimal outpatient appointment scheduling. Health Care Management Science 2007;10(3):217–229. https://doi.org/10.1007/s10729-007-9015-x.</w:t>
       </w:r>
     </w:p>
     <w:p>
@@ -10868,7 +11216,7 @@
           <w:sz w:val="24"/>
           <w:szCs w:val="24"/>
         </w:rPr>
-        <w:t>[8] Ahmadi-Javid A, Jalali Z, Klassen KJ. Outpatient appointment systems in healthcare: a review of optimization studies. European Journal of Operational Research 2017;258(1):3–34. https://doi.org/10.1016/j.ejor.2016.06.064.</w:t>
+        <w:t>[8] Salzarulo PA, Bretthauer KM, Côté MJ, Schultz KL. The impact of variability and patient information on health care system performance. Production and Operations Management 2011;20(6):848–859. https://doi.org/10.1111/j.1937-5956.2010.01210.x.</w:t>
       </w:r>
     </w:p>
     <w:p>
@@ -10879,7 +11227,7 @@
           <w:sz w:val="24"/>
           <w:szCs w:val="24"/>
         </w:rPr>
-        <w:t>[9] Denton B, Gupta D. A sequential bounding approach for optimal appointment scheduling. IIE Transactions 2003;35(11):1003–1016. https://doi.org/10.1080/07408170304395.</w:t>
+        <w:t>[9] Mak HY, Rong Y, Zhang J. Appointment scheduling with limited distributional information. Management Science 2015;61(2):316–334. https://doi.org/10.1287/mnsc.2013.1881.</w:t>
       </w:r>
     </w:p>
     <w:p>
@@ -10890,7 +11238,7 @@
           <w:sz w:val="24"/>
           <w:szCs w:val="24"/>
         </w:rPr>
-        <w:t>[10] Kaandorp GC, Koole G. Optimal outpatient appointment scheduling. Health Care Management Science 2007;10(3):217–229. https://doi.org/10.1007/s10729-007-9015-x.</w:t>
+        <w:t>[10] van Eekelen W, den Hertog D, van Leeuwaarden J. Distributionally robust appointment scheduling that can deal with independent service times. SSRN preprint; 2024. https://doi.org/10.2139/ssrn.4892477.</w:t>
       </w:r>
     </w:p>
     <w:p>
@@ -10901,7 +11249,7 @@
           <w:sz w:val="24"/>
           <w:szCs w:val="24"/>
         </w:rPr>
-        <w:t>[11] Begen MA, Queyranne M. Appointment scheduling with discrete random durations. Mathematics of Operations Research 2011;36(2):240–257. https://doi.org/10.1287/moor.1110.0489.</w:t>
+        <w:t>[11] Lindley DV. The theory of queues with a single server. Mathematical Proceedings of the Cambridge Philosophical Society 1952;48(2):277–289. https://doi.org/10.1017/s0305004100027638.</w:t>
       </w:r>
     </w:p>
     <w:p>
@@ -10912,7 +11260,7 @@
           <w:sz w:val="24"/>
           <w:szCs w:val="24"/>
         </w:rPr>
-        <w:t>[12] Robinson LW, Chen RR. Scheduling doctors' appointments: optimal and empirically-based heuristic policies. IIE Transactions 2003;35(3):295–307. https://doi.org/10.1080/07408170304367.</w:t>
+        <w:t>[12] Rockafellar RT, Uryasev S. Optimization of conditional value-at-risk. The Journal of Risk 2000;2(3):21–41. https://doi.org/10.21314/jor.2000.038.</w:t>
       </w:r>
     </w:p>
     <w:p>
@@ -10923,7 +11271,7 @@
           <w:sz w:val="24"/>
           <w:szCs w:val="24"/>
         </w:rPr>
-        <w:t>[13] Klassen KJ, Yoogalingam R. Appointment system design with interruptions and physician lateness. International Journal of Operations &amp; Production Management 2013;33(4):394–414. https://doi.org/10.1108/01443571311307253.</w:t>
+        <w:t>[13] Bertsimas D, Sim M. The price of robustness. Operations Research 2004;52(1):35–53. https://doi.org/10.1287/opre.1030.0065.</w:t>
       </w:r>
     </w:p>
     <w:p>
@@ -10934,7 +11282,7 @@
           <w:sz w:val="24"/>
           <w:szCs w:val="24"/>
         </w:rPr>
-        <w:t>[14] Deceuninck M, Fiems D, De Vuyst S. Outpatient scheduling with unpunctual patients and no-shows. European Journal of Operational Research 2018;265(1):195–207. https://doi.org/10.1016/j.ejor.2017.07.006.</w:t>
+        <w:t>[14] Rahimian H, Mehrotra S. Frameworks and results in distributionally robust optimization. Open Journal of Mathematical Optimization 2022;3:1–85. https://doi.org/10.5802/ojmo.15.</w:t>
       </w:r>
     </w:p>
     <w:p>
@@ -10945,7 +11293,7 @@
           <w:sz w:val="24"/>
           <w:szCs w:val="24"/>
         </w:rPr>
-        <w:t>[15] Hassin R, Mendel S. Scheduling arrivals to queues: a single-server model with no-shows. Management Science 2008;54(3):565–572. https://doi.org/10.1287/mnsc.1070.0802.</w:t>
+        <w:t>[15] Pinedo ML. Selected scheduling systems. In: Scheduling. Springer US; 2011. p. 611–613. https://doi.org/10.1007/978-1-4614-2361-4_27.</w:t>
       </w:r>
     </w:p>
     <w:p>
@@ -10956,7 +11304,7 @@
           <w:sz w:val="24"/>
           <w:szCs w:val="24"/>
         </w:rPr>
-        <w:t>[16] Muthuraman K, Lawley M. A stochastic overbooking model for outpatient clinical scheduling with no-shows. IIE Transactions 2008;40(9):820–837. https://doi.org/10.1080/07408170802165823.</w:t>
+        <w:t>[16] Soriano A. Comparison of two scheduling systems. Operations Research 1966;14(3):388–397. https://doi.org/10.1287/opre.14.3.388.</w:t>
       </w:r>
     </w:p>
     <w:p>
@@ -10967,7 +11315,7 @@
           <w:sz w:val="24"/>
           <w:szCs w:val="24"/>
         </w:rPr>
-        <w:t>[17] Zacharias C, Pinedo M. Appointment scheduling with no-shows and overbooking. Production and Operations Management 2014;23(5):788–801. https://doi.org/10.1111/poms.12065.</w:t>
+        <w:t>[17] Robinson LW, Chen RR. Scheduling doctors' appointments: optimal and empirically-based heuristic policies. IIE Transactions 2003;35(3):295–307. https://doi.org/10.1080/07408170304367.</w:t>
       </w:r>
     </w:p>
     <w:p>
@@ -10978,7 +11326,7 @@
           <w:sz w:val="24"/>
           <w:szCs w:val="24"/>
         </w:rPr>
-        <w:t>[18] Salzarulo PA, Bretthauer KM, Côté MJ, Schultz KL. The impact of variability and patient information on health care system performance. Production and Operations Management 2011;20(6):848–859. https://doi.org/10.1111/j.1937-5956.2010.01210.x.</w:t>
+        <w:t>[18] Kong Q, Lee CY, Teo CP, Zheng Z. Scheduling arrivals to a stochastic service delivery system using copositive cones. Operations Research 2013;61(3):711–726. https://doi.org/10.1287/opre.2013.1158.</w:t>
       </w:r>
     </w:p>
     <w:p>
@@ -10989,7 +11337,7 @@
           <w:sz w:val="24"/>
           <w:szCs w:val="24"/>
         </w:rPr>
-        <w:t>[19] Mak HY, Rong Y, Zhang J. Appointment scheduling with limited distributional information. Management Science 2015;61(2):316–334. https://doi.org/10.1287/mnsc.2013.1881.</w:t>
+        <w:t>[19] Bauerhenne C, Kolisch R, Schulz AS. Robust appointment scheduling with waiting time guarantees. Manufacturing &amp; Service Operations Management 2026;28(3):995–1009. https://doi.org/10.1287/msom.2024.0852.</w:t>
       </w:r>
     </w:p>
     <w:p>
@@ -11000,7 +11348,7 @@
           <w:sz w:val="24"/>
           <w:szCs w:val="24"/>
         </w:rPr>
-        <w:t>[20] van Eekelen W, den Hertog D, van Leeuwaarden J. Distributionally robust appointment scheduling that can deal with independent service times. SSRN preprint; 2024. https://doi.org/10.2139/ssrn.4892477.</w:t>
+        <w:t>[20] Hassin R, Mendel S. Scheduling arrivals to queues: a single-server model with no-shows. Management Science 2008;54(3):565–572. https://doi.org/10.1287/mnsc.1070.0802.</w:t>
       </w:r>
     </w:p>
     <w:p>
@@ -11011,7 +11359,7 @@
           <w:sz w:val="24"/>
           <w:szCs w:val="24"/>
         </w:rPr>
-        <w:t>[21] Bauerhenne C, Kolisch R, Schulz AS. Robust appointment scheduling with waiting time guarantees. Manufacturing &amp; Service Operations Management 2026;28(3):995–1009. https://doi.org/10.1287/msom.2024.0852.</w:t>
+        <w:t>[21] Muthuraman K, Lawley M. A stochastic overbooking model for outpatient clinical scheduling with no-shows. IIE Transactions 2008;40(9):820–837. https://doi.org/10.1080/07408170802165823.</w:t>
       </w:r>
     </w:p>
     <w:p>
@@ -11022,7 +11370,7 @@
           <w:sz w:val="24"/>
           <w:szCs w:val="24"/>
         </w:rPr>
-        <w:t>[22] Rockafellar RT, Uryasev S. Optimization of conditional value-at-risk. The Journal of Risk 2000;2(3):21–41. https://doi.org/10.21314/jor.2000.038.</w:t>
+        <w:t>[22] Zacharias C, Pinedo M. Appointment scheduling with no-shows and overbooking. Production and Operations Management 2014;23(5):788–801. https://doi.org/10.1111/poms.12065.</w:t>
       </w:r>
     </w:p>
     <w:p>
@@ -11033,7 +11381,7 @@
           <w:sz w:val="24"/>
           <w:szCs w:val="24"/>
         </w:rPr>
-        <w:t>[23] Bertsimas D, Sim M. The price of robustness. Operations Research 2004;52(1):35–53. https://doi.org/10.1287/opre.1030.0065.</w:t>
+        <w:t>[23] Deceuninck M, Fiems D, De Vuyst S. Outpatient scheduling with unpunctual patients and no-shows. European Journal of Operational Research 2018;265(1):195–207. https://doi.org/10.1016/j.ejor.2017.07.006.</w:t>
       </w:r>
     </w:p>
     <w:p>
@@ -11044,7 +11392,7 @@
           <w:sz w:val="24"/>
           <w:szCs w:val="24"/>
         </w:rPr>
-        <w:t>[24] Rahimian H, Mehrotra S. Frameworks and results in distributionally robust optimization. Open Journal of Mathematical Optimization 2022;3:1–85. https://doi.org/10.5802/ojmo.15.</w:t>
+        <w:t>[24] Begen MA, Queyranne M. Appointment scheduling with discrete random durations. Mathematics of Operations Research 2011;36(2):240–257. https://doi.org/10.1287/moor.1110.0489.</w:t>
       </w:r>
     </w:p>
     <w:p>
@@ -11055,7 +11403,7 @@
           <w:sz w:val="24"/>
           <w:szCs w:val="24"/>
         </w:rPr>
-        <w:t>[25] Pinedo ML. Selected scheduling systems. In: Scheduling. Springer US; 2011. p. 611–613. https://doi.org/10.1007/978-1-4614-2361-4_27.</w:t>
+        <w:t>[25] Berg BP, Denton BT, Ayca Erdogan S, Rohleder T, Huschka T. Optimal booking and scheduling in outpatient procedure centers. Computers &amp; Operations Research 2014;50:24–37. https://doi.org/10.1016/j.cor.2014.04.007.</w:t>
       </w:r>
     </w:p>
     <w:p>
@@ -11066,7 +11414,7 @@
           <w:sz w:val="24"/>
           <w:szCs w:val="24"/>
         </w:rPr>
-        <w:t>[26] Kong Q, Lee CY, Teo CP, Zheng Z. Scheduling arrivals to a stochastic service delivery system using copositive cones. Operations Research 2013;61(3):711–726. https://doi.org/10.1287/opre.2013.1158.</w:t>
+        <w:t>[26] Chen RR, Robinson LW. Sequencing and scheduling appointments with potential call-in patients. Production and Operations Management 2014;23(9):1522–1538. https://doi.org/10.1111/poms.12168.</w:t>
       </w:r>
     </w:p>
     <w:p>
@@ -11077,7 +11425,7 @@
           <w:sz w:val="24"/>
           <w:szCs w:val="24"/>
         </w:rPr>
-        <w:t>[27] Berg BP, Denton BT, Ayca Erdogan S, Rohleder T, Huschka T. Optimal booking and scheduling in outpatient procedure centers. Computers &amp; Operations Research 2014;50:24–37. https://doi.org/10.1016/j.cor.2014.04.007.</w:t>
+        <w:t>[27] Pan X, Geng N, Xie X. Appointment scheduling and real-time sequencing strategies for patient unpunctuality. European Journal of Operational Research 2021;295(1):246–260. https://doi.org/10.1016/j.ejor.2021.02.055.</w:t>
       </w:r>
     </w:p>
     <w:p>
@@ -11088,7 +11436,7 @@
           <w:sz w:val="24"/>
           <w:szCs w:val="24"/>
         </w:rPr>
-        <w:t>[28] Chen RR, Robinson LW. Sequencing and scheduling appointments with potential call-in patients. Production and Operations Management 2014;23(9):1522–1538. https://doi.org/10.1111/poms.12168.</w:t>
+        <w:t>[28] Cayirli T, Veral E, Rosen H. Designing appointment scheduling systems for ambulatory care services. Health Care Management Science 2006;9(1):47–58. https://doi.org/10.1007/s10729-006-6279-5.</w:t>
       </w:r>
     </w:p>
     <w:p>
@@ -11099,7 +11447,7 @@
           <w:sz w:val="24"/>
           <w:szCs w:val="24"/>
         </w:rPr>
-        <w:t>[29] Pan X, Geng N, Xie X. Appointment scheduling and real-time sequencing strategies for patient unpunctuality. European Journal of Operational Research 2021;295(1):246–260. https://doi.org/10.1016/j.ejor.2021.02.055.</w:t>
+        <w:t>[29] Wang J, Fung RYK. Dynamic appointment scheduling with patient preferences and choices. Industrial Management &amp; Data Systems 2015;115(4):700–717. https://doi.org/10.1108/imds-12-2014-0372.</w:t>
       </w:r>
     </w:p>
     <w:p>
@@ -11110,7 +11458,7 @@
           <w:sz w:val="24"/>
           <w:szCs w:val="24"/>
         </w:rPr>
-        <w:t>[30] Wang J, Fung RYK. Dynamic appointment scheduling with patient preferences and choices. Industrial Management &amp; Data Systems 2015;115(4):700–717. https://doi.org/10.1108/imds-12-2014-0372.</w:t>
+        <w:t>[30] Klassen KJ, Yoogalingam R. Appointment system design with interruptions and physician lateness. International Journal of Operations &amp; Production Management 2013;33(4):394–414. https://doi.org/10.1108/01443571311307253.</w:t>
       </w:r>
     </w:p>
     <w:sectPr>

</xml_diff>

<commit_message>
Sync Omega range and negative-zero rendering corrections
Co-Authored-By: Tatsuki Onishi <bougtoir@gmail.com>
</commit_message>
<xml_diff>
--- a/manuscript/manuscript_inline.docx
+++ b/manuscript/manuscript_inline.docx
@@ -5306,7 +5306,7 @@
             <w:sz w:val="24"/>
             <w:szCs w:val="24"/>
           </w:rPr>
-          <m:t>--</m:t>
+          <m:t>–</m:t>
         </m:r>
         <m:r>
           <m:rPr>
@@ -5720,7 +5720,7 @@
             <w:sz w:val="24"/>
             <w:szCs w:val="24"/>
           </w:rPr>
-          <m:t>--</m:t>
+          <m:t>–</m:t>
         </m:r>
         <m:r>
           <m:rPr>

</xml_diff>